<commit_message>
bersihkan docs, tambah yt_script.py, perbaiki generate_report.py
</commit_message>
<xml_diff>
--- a/reports/Laporan_UAS_Deteksi_Kerusuhan.docx
+++ b/reports/Laporan_UAS_Deteksi_Kerusuhan.docx
@@ -374,11 +374,27 @@
       </w:r>
     </w:p>
     <w:p>
+      <w:r>
+        <w:t>Tujuan dari project ini adalah:</w:t>
+        <w:br/>
+        <w:br/>
+        <w:t>1. Mengumpulkan dataset video kerusuhan dari berbagai sumber (YouTube, Kaggle, SCVD, MSV-PG) dengan total 5.552 video</w:t>
+        <w:br/>
+        <w:t>2. Mengekstrak fitur temporal video menggunakan S3D pre-trained pada Kinetics-400</w:t>
+        <w:br/>
+        <w:t>3. Mengimplementasikan dan membandingkan dua arsitektur MIL: frame-level dan video-level</w:t>
+        <w:br/>
+        <w:t>4. Mengoptimalkan model melalui hyperparameter tuning dan evaluasi komprehensif</w:t>
+        <w:br/>
+        <w:t>5. Membangun aplikasi Streamlit untuk demonstrasi model secara interaktif</w:t>
+      </w:r>
+    </w:p>
+    <w:p>
       <w:pPr>
         <w:pStyle w:val="Heading2"/>
       </w:pPr>
       <w:r>
-        <w:t>1.5 Perbandingan Algoritma</w:t>
+        <w:t>1.4 Perbandingan Algoritma</w:t>
       </w:r>
     </w:p>
     <w:p>
@@ -405,27 +421,11 @@
       </w:r>
     </w:p>
     <w:p>
-      <w:r>
-        <w:t>Tujuan dari project ini adalah:</w:t>
-        <w:br/>
-        <w:br/>
-        <w:t>1. Mengumpulkan dataset video kerusuhan dari berbagai sumber (YouTube, Kaggle, SCVD, MSV-PG) dengan total 5.552 video</w:t>
-        <w:br/>
-        <w:t>2. Mengekstrak fitur temporal video menggunakan S3D pre-trained pada Kinetics-400</w:t>
-        <w:br/>
-        <w:t>3. Mengimplementasikan dan membandingkan dua arsitektur MIL: frame-level dan video-level</w:t>
-        <w:br/>
-        <w:t>4. Mengoptimalkan model melalui hyperparameter tuning dan evaluasi komprehensif</w:t>
-        <w:br/>
-        <w:t>5. Membangun aplikasi Streamlit untuk demonstrasi model secara interaktif</w:t>
-      </w:r>
-    </w:p>
-    <w:p>
       <w:pPr>
         <w:pStyle w:val="Heading2"/>
       </w:pPr>
       <w:r>
-        <w:t>1.4 Ruang Lingkup</w:t>
+        <w:t>1.5 Ruang Lingkup</w:t>
       </w:r>
     </w:p>
     <w:p>
@@ -709,7 +709,7 @@
     </w:p>
     <w:p>
       <w:r>
-        <w:t>Dataset yang digunakan dalam project ini berjumlah 5590 video yang terdiri dari 3266 video non-rusuh (demo_damai + normal) dan 2286 video rusuh (demo_rusuh). Dataset dibagi menjadi 4440 training, 553 validation, dan 559 testing.</w:t>
+        <w:t>Dataset yang digunakan dalam project ini berjumlah 5552 video yang terdiri dari 3266 video non-rusuh (demo_damai + normal) dan 2286 video rusuh (demo_rusuh). Dataset dibagi menjadi 4440 training, 553 validation, dan 559 testing.</w:t>
       </w:r>
     </w:p>
     <w:p>
@@ -985,104 +985,6 @@
                 <w:sz w:val="20"/>
               </w:rPr>
               <w:t>87.30%</w:t>
-            </w:r>
-          </w:p>
-        </w:tc>
-      </w:tr>
-      <w:tr>
-        <w:tc>
-          <w:tcPr>
-            <w:tcW w:type="dxa" w:w="1440"/>
-          </w:tcPr>
-          <w:p>
-            <w:pPr>
-              <w:jc w:val="center"/>
-            </w:pPr>
-            <w:r>
-              <w:rPr>
-                <w:sz w:val="20"/>
-              </w:rPr>
-              <w:t>MILRanking (Frame)</w:t>
-            </w:r>
-          </w:p>
-        </w:tc>
-        <w:tc>
-          <w:tcPr>
-            <w:tcW w:type="dxa" w:w="1440"/>
-          </w:tcPr>
-          <w:p>
-            <w:pPr>
-              <w:jc w:val="center"/>
-            </w:pPr>
-            <w:r>
-              <w:rPr>
-                <w:sz w:val="20"/>
-              </w:rPr>
-              <w:t>0.9124</w:t>
-            </w:r>
-          </w:p>
-        </w:tc>
-        <w:tc>
-          <w:tcPr>
-            <w:tcW w:type="dxa" w:w="1440"/>
-          </w:tcPr>
-          <w:p>
-            <w:pPr>
-              <w:jc w:val="center"/>
-            </w:pPr>
-            <w:r>
-              <w:rPr>
-                <w:sz w:val="20"/>
-              </w:rPr>
-              <w:t>0.8315</w:t>
-            </w:r>
-          </w:p>
-        </w:tc>
-        <w:tc>
-          <w:tcPr>
-            <w:tcW w:type="dxa" w:w="1440"/>
-          </w:tcPr>
-          <w:p>
-            <w:pPr>
-              <w:jc w:val="center"/>
-            </w:pPr>
-            <w:r>
-              <w:rPr>
-                <w:sz w:val="20"/>
-              </w:rPr>
-              <w:t>0.8241</w:t>
-            </w:r>
-          </w:p>
-        </w:tc>
-        <w:tc>
-          <w:tcPr>
-            <w:tcW w:type="dxa" w:w="1440"/>
-          </w:tcPr>
-          <w:p>
-            <w:pPr>
-              <w:jc w:val="center"/>
-            </w:pPr>
-            <w:r>
-              <w:rPr>
-                <w:sz w:val="20"/>
-              </w:rPr>
-              <w:t>0.8390</w:t>
-            </w:r>
-          </w:p>
-        </w:tc>
-        <w:tc>
-          <w:tcPr>
-            <w:tcW w:type="dxa" w:w="1440"/>
-          </w:tcPr>
-          <w:p>
-            <w:pPr>
-              <w:jc w:val="center"/>
-            </w:pPr>
-            <w:r>
-              <w:rPr>
-                <w:sz w:val="20"/>
-              </w:rPr>
-              <w:t>85.30%</w:t>
             </w:r>
           </w:p>
         </w:tc>

</xml_diff>